<commit_message>
Update Technical Report Template (2).docx
</commit_message>
<xml_diff>
--- a/docs/Technical Report Template (2).docx
+++ b/docs/Technical Report Template (2).docx
@@ -2971,9 +2971,36 @@
     <w:p/>
     <w:p>
       <w:pPr>
+        <w:rPr>
+          <w:rFonts w:asciiTheme="majorHAnsi" w:eastAsiaTheme="majorEastAsia" w:hAnsiTheme="majorHAnsi" w:cstheme="majorBidi"/>
+          <w:color w:val="2E74B5" w:themeColor="accent1" w:themeShade="BF"/>
+          <w:sz w:val="32"/>
+          <w:szCs w:val="32"/>
+        </w:rPr>
+      </w:pPr>
+      <w:bookmarkStart w:id="0" w:name="_Toc87019665"/>
+      <w:r>
+        <w:br w:type="page"/>
+      </w:r>
+    </w:p>
+    <w:p>
+      <w:pPr>
+        <w:rPr>
+          <w:rFonts w:asciiTheme="majorHAnsi" w:eastAsiaTheme="majorEastAsia" w:hAnsiTheme="majorHAnsi" w:cstheme="majorBidi"/>
+          <w:color w:val="2E74B5" w:themeColor="accent1" w:themeShade="BF"/>
+          <w:sz w:val="32"/>
+          <w:szCs w:val="32"/>
+        </w:rPr>
+      </w:pPr>
+      <w:r>
+        <w:lastRenderedPageBreak/>
+        <w:br w:type="page"/>
+      </w:r>
+    </w:p>
+    <w:p>
+      <w:pPr>
         <w:pStyle w:val="Heading1"/>
       </w:pPr>
-      <w:bookmarkStart w:id="0" w:name="_Toc87019665"/>
       <w:r>
         <w:lastRenderedPageBreak/>
         <w:t>Executive Summary</w:t>
@@ -3479,46 +3506,9 @@
           <w:highlight w:val="yellow"/>
           <w:lang w:val="en-GB"/>
         </w:rPr>
-        <w:t>This use case describes the ………..</w:t>
-      </w:r>
-      <w:r>
-        <w:rPr>
-          <w:sz w:val="24"/>
-          <w:szCs w:val="24"/>
-          <w:lang w:val="en-GB"/>
-        </w:rPr>
-        <w:t xml:space="preserve"> </w:t>
-      </w:r>
-    </w:p>
-    <w:p>
-      <w:pPr>
-        <w:ind w:left="1080"/>
-        <w:rPr>
-          <w:b/>
-          <w:sz w:val="24"/>
-          <w:szCs w:val="24"/>
-          <w:lang w:val="en-GB"/>
-        </w:rPr>
-      </w:pPr>
-      <w:r>
-        <w:rPr>
-          <w:b/>
-          <w:sz w:val="24"/>
-          <w:szCs w:val="24"/>
-          <w:lang w:val="en-GB"/>
-        </w:rPr>
-        <w:t>Use Case Diagram</w:t>
-      </w:r>
-    </w:p>
-    <w:p>
-      <w:pPr>
-        <w:ind w:left="1080"/>
-        <w:rPr>
-          <w:sz w:val="24"/>
-          <w:szCs w:val="24"/>
-          <w:lang w:val="en-GB"/>
-        </w:rPr>
-      </w:pPr>
+        <w:t>This use case describes the ……</w:t>
+      </w:r>
+      <w:proofErr w:type="gramStart"/>
       <w:r>
         <w:rPr>
           <w:sz w:val="24"/>
@@ -3526,7 +3516,16 @@
           <w:highlight w:val="yellow"/>
           <w:lang w:val="en-GB"/>
         </w:rPr>
-        <w:t>Diagram should highlight actors and uses cases……..</w:t>
+        <w:t>…..</w:t>
+      </w:r>
+      <w:proofErr w:type="gramEnd"/>
+      <w:r>
+        <w:rPr>
+          <w:sz w:val="24"/>
+          <w:szCs w:val="24"/>
+          <w:lang w:val="en-GB"/>
+        </w:rPr>
+        <w:t xml:space="preserve"> </w:t>
       </w:r>
     </w:p>
     <w:p>
@@ -3546,25 +3545,7 @@
           <w:szCs w:val="24"/>
           <w:lang w:val="en-GB"/>
         </w:rPr>
-        <w:t>Flow Description</w:t>
-      </w:r>
-    </w:p>
-    <w:p>
-      <w:pPr>
-        <w:ind w:left="1080"/>
-        <w:rPr>
-          <w:b/>
-          <w:sz w:val="24"/>
-          <w:szCs w:val="24"/>
-        </w:rPr>
-      </w:pPr>
-      <w:r>
-        <w:rPr>
-          <w:b/>
-          <w:sz w:val="24"/>
-          <w:szCs w:val="24"/>
-        </w:rPr>
-        <w:t>Precondition</w:t>
+        <w:t>Use Case Diagram</w:t>
       </w:r>
     </w:p>
     <w:p>
@@ -3583,8 +3564,87 @@
           <w:highlight w:val="yellow"/>
           <w:lang w:val="en-GB"/>
         </w:rPr>
-        <w:t>The system is in initialisation mode……..</w:t>
-      </w:r>
+        <w:t>Diagram should highlight actors and uses cases…</w:t>
+      </w:r>
+      <w:proofErr w:type="gramStart"/>
+      <w:r>
+        <w:rPr>
+          <w:sz w:val="24"/>
+          <w:szCs w:val="24"/>
+          <w:highlight w:val="yellow"/>
+          <w:lang w:val="en-GB"/>
+        </w:rPr>
+        <w:t>…..</w:t>
+      </w:r>
+      <w:proofErr w:type="gramEnd"/>
+    </w:p>
+    <w:p>
+      <w:pPr>
+        <w:ind w:left="1080"/>
+        <w:rPr>
+          <w:b/>
+          <w:sz w:val="24"/>
+          <w:szCs w:val="24"/>
+          <w:lang w:val="en-GB"/>
+        </w:rPr>
+      </w:pPr>
+      <w:r>
+        <w:rPr>
+          <w:b/>
+          <w:sz w:val="24"/>
+          <w:szCs w:val="24"/>
+          <w:lang w:val="en-GB"/>
+        </w:rPr>
+        <w:t>Flow Description</w:t>
+      </w:r>
+    </w:p>
+    <w:p>
+      <w:pPr>
+        <w:ind w:left="1080"/>
+        <w:rPr>
+          <w:b/>
+          <w:sz w:val="24"/>
+          <w:szCs w:val="24"/>
+        </w:rPr>
+      </w:pPr>
+      <w:r>
+        <w:rPr>
+          <w:b/>
+          <w:sz w:val="24"/>
+          <w:szCs w:val="24"/>
+        </w:rPr>
+        <w:t>Precondition</w:t>
+      </w:r>
+    </w:p>
+    <w:p>
+      <w:pPr>
+        <w:ind w:left="1080"/>
+        <w:rPr>
+          <w:sz w:val="24"/>
+          <w:szCs w:val="24"/>
+          <w:lang w:val="en-GB"/>
+        </w:rPr>
+      </w:pPr>
+      <w:r>
+        <w:rPr>
+          <w:sz w:val="24"/>
+          <w:szCs w:val="24"/>
+          <w:highlight w:val="yellow"/>
+          <w:lang w:val="en-GB"/>
+        </w:rPr>
+        <w:t>The system is in initialisation mode…</w:t>
+      </w:r>
+      <w:proofErr w:type="gramStart"/>
+      <w:r>
+        <w:rPr>
+          <w:sz w:val="24"/>
+          <w:szCs w:val="24"/>
+          <w:highlight w:val="yellow"/>
+          <w:lang w:val="en-GB"/>
+        </w:rPr>
+        <w:t>…..</w:t>
+      </w:r>
+      <w:proofErr w:type="gramEnd"/>
     </w:p>
     <w:p>
       <w:pPr>
@@ -3725,7 +3785,27 @@
           <w:highlight w:val="yellow"/>
           <w:lang w:val="en-GB"/>
         </w:rPr>
-        <w:t>The system …………..(See E1)</w:t>
+        <w:t>The system ………</w:t>
+      </w:r>
+      <w:proofErr w:type="gramStart"/>
+      <w:r>
+        <w:rPr>
+          <w:sz w:val="24"/>
+          <w:szCs w:val="24"/>
+          <w:highlight w:val="yellow"/>
+          <w:lang w:val="en-GB"/>
+        </w:rPr>
+        <w:t>…..</w:t>
+      </w:r>
+      <w:proofErr w:type="gramEnd"/>
+      <w:r>
+        <w:rPr>
+          <w:sz w:val="24"/>
+          <w:szCs w:val="24"/>
+          <w:highlight w:val="yellow"/>
+          <w:lang w:val="en-GB"/>
+        </w:rPr>
+        <w:t>(See E1)</w:t>
       </w:r>
     </w:p>
     <w:p>
@@ -3828,8 +3908,19 @@
           <w:highlight w:val="yellow"/>
           <w:lang w:val="en-GB"/>
         </w:rPr>
-        <w:t>The system …………..</w:t>
-      </w:r>
+        <w:t>The system ………</w:t>
+      </w:r>
+      <w:proofErr w:type="gramStart"/>
+      <w:r>
+        <w:rPr>
+          <w:sz w:val="24"/>
+          <w:szCs w:val="24"/>
+          <w:highlight w:val="yellow"/>
+          <w:lang w:val="en-GB"/>
+        </w:rPr>
+        <w:t>…..</w:t>
+      </w:r>
+      <w:proofErr w:type="gramEnd"/>
     </w:p>
     <w:p>
       <w:pPr>
@@ -3965,8 +4056,19 @@
           <w:highlight w:val="yellow"/>
           <w:lang w:val="en-GB"/>
         </w:rPr>
-        <w:t>The system …………..</w:t>
-      </w:r>
+        <w:t>The system ………</w:t>
+      </w:r>
+      <w:proofErr w:type="gramStart"/>
+      <w:r>
+        <w:rPr>
+          <w:sz w:val="24"/>
+          <w:szCs w:val="24"/>
+          <w:highlight w:val="yellow"/>
+          <w:lang w:val="en-GB"/>
+        </w:rPr>
+        <w:t>…..</w:t>
+      </w:r>
+      <w:proofErr w:type="gramEnd"/>
     </w:p>
     <w:p>
       <w:pPr>
@@ -4276,7 +4378,25 @@
           <w:szCs w:val="24"/>
           <w:highlight w:val="yellow"/>
         </w:rPr>
-        <w:t>Describe the main algorithms/classes/functions used in the code. Consider to show and explain interesting code snippets where appropriate.</w:t>
+        <w:t xml:space="preserve">Describe the main algorithms/classes/functions used in the code. Consider </w:t>
+      </w:r>
+      <w:proofErr w:type="gramStart"/>
+      <w:r>
+        <w:rPr>
+          <w:sz w:val="24"/>
+          <w:szCs w:val="24"/>
+          <w:highlight w:val="yellow"/>
+        </w:rPr>
+        <w:t>to show</w:t>
+      </w:r>
+      <w:proofErr w:type="gramEnd"/>
+      <w:r>
+        <w:rPr>
+          <w:sz w:val="24"/>
+          <w:szCs w:val="24"/>
+          <w:highlight w:val="yellow"/>
+        </w:rPr>
+        <w:t xml:space="preserve"> and explain interesting code snippets where appropriate.</w:t>
       </w:r>
     </w:p>
     <w:p>
@@ -5430,7 +5550,23 @@
           <w:rFonts w:asciiTheme="minorHAnsi" w:hAnsiTheme="minorHAnsi" w:cstheme="minorHAnsi"/>
           <w:bCs/>
         </w:rPr>
-        <w:t xml:space="preserve"> (Please highlight the novelty/patentable aspect. Attach extra sheets if necessary including diagrams where appropriate).  What is novel, the ‘inventive step’? For more information on patents, please look at </w:t>
+        <w:t xml:space="preserve"> (Please highlight the novelty/patentable aspect. Attach extra sheets if </w:t>
+      </w:r>
+      <w:proofErr w:type="gramStart"/>
+      <w:r>
+        <w:rPr>
+          <w:rFonts w:asciiTheme="minorHAnsi" w:hAnsiTheme="minorHAnsi" w:cstheme="minorHAnsi"/>
+          <w:bCs/>
+        </w:rPr>
+        <w:t>necessary</w:t>
+      </w:r>
+      <w:proofErr w:type="gramEnd"/>
+      <w:r>
+        <w:rPr>
+          <w:rFonts w:asciiTheme="minorHAnsi" w:hAnsiTheme="minorHAnsi" w:cstheme="minorHAnsi"/>
+          <w:bCs/>
+        </w:rPr>
+        <w:t xml:space="preserve"> including diagrams where appropriate).  What is novel, the ‘inventive step’? For more information on patents, please look at </w:t>
       </w:r>
       <w:hyperlink r:id="rId13" w:history="1">
         <w:r>
@@ -5595,7 +5731,35 @@
         <w:rPr>
           <w:rFonts w:asciiTheme="minorHAnsi" w:hAnsiTheme="minorHAnsi" w:cstheme="minorHAnsi"/>
         </w:rPr>
-        <w:t xml:space="preserve">What is its novel or unusual features? What problems does it solve? </w:t>
+        <w:t xml:space="preserve">What is its novel or unusual features? What problems </w:t>
+      </w:r>
+      <w:proofErr w:type="gramStart"/>
+      <w:r>
+        <w:rPr>
+          <w:rFonts w:asciiTheme="minorHAnsi" w:hAnsiTheme="minorHAnsi" w:cstheme="minorHAnsi"/>
+        </w:rPr>
+        <w:t>does</w:t>
+      </w:r>
+      <w:proofErr w:type="gramEnd"/>
+      <w:r>
+        <w:rPr>
+          <w:rFonts w:asciiTheme="minorHAnsi" w:hAnsiTheme="minorHAnsi" w:cstheme="minorHAnsi"/>
+        </w:rPr>
+        <w:t xml:space="preserve"> </w:t>
+      </w:r>
+      <w:proofErr w:type="gramStart"/>
+      <w:r>
+        <w:rPr>
+          <w:rFonts w:asciiTheme="minorHAnsi" w:hAnsiTheme="minorHAnsi" w:cstheme="minorHAnsi"/>
+        </w:rPr>
+        <w:t>it</w:t>
+      </w:r>
+      <w:proofErr w:type="gramEnd"/>
+      <w:r>
+        <w:rPr>
+          <w:rFonts w:asciiTheme="minorHAnsi" w:hAnsiTheme="minorHAnsi" w:cstheme="minorHAnsi"/>
+        </w:rPr>
+        <w:t xml:space="preserve"> solve? </w:t>
       </w:r>
       <w:r>
         <w:rPr>
@@ -6387,7 +6551,21 @@
               <w:rPr>
                 <w:rFonts w:asciiTheme="minorHAnsi" w:hAnsiTheme="minorHAnsi" w:cstheme="minorHAnsi"/>
               </w:rPr>
-              <w:t>Industry or other Sponsor</w:t>
+              <w:t xml:space="preserve">Industry or </w:t>
+            </w:r>
+            <w:proofErr w:type="gramStart"/>
+            <w:r>
+              <w:rPr>
+                <w:rFonts w:asciiTheme="minorHAnsi" w:hAnsiTheme="minorHAnsi" w:cstheme="minorHAnsi"/>
+              </w:rPr>
+              <w:t>other</w:t>
+            </w:r>
+            <w:proofErr w:type="gramEnd"/>
+            <w:r>
+              <w:rPr>
+                <w:rFonts w:asciiTheme="minorHAnsi" w:hAnsiTheme="minorHAnsi" w:cstheme="minorHAnsi"/>
+              </w:rPr>
+              <w:t xml:space="preserve"> Sponsor</w:t>
             </w:r>
           </w:p>
         </w:tc>
@@ -6887,7 +7065,23 @@
           <w:rFonts w:asciiTheme="minorHAnsi" w:hAnsiTheme="minorHAnsi" w:cstheme="minorHAnsi"/>
           <w:bCs/>
         </w:rPr>
-        <w:t>If so please give details and provide signed agreements where relevant.</w:t>
+        <w:t xml:space="preserve">If </w:t>
+      </w:r>
+      <w:proofErr w:type="gramStart"/>
+      <w:r>
+        <w:rPr>
+          <w:rFonts w:asciiTheme="minorHAnsi" w:hAnsiTheme="minorHAnsi" w:cstheme="minorHAnsi"/>
+          <w:bCs/>
+        </w:rPr>
+        <w:t>so</w:t>
+      </w:r>
+      <w:proofErr w:type="gramEnd"/>
+      <w:r>
+        <w:rPr>
+          <w:rFonts w:asciiTheme="minorHAnsi" w:hAnsiTheme="minorHAnsi" w:cstheme="minorHAnsi"/>
+          <w:bCs/>
+        </w:rPr>
+        <w:t xml:space="preserve"> please give details and provide signed agreements where relevant.</w:t>
       </w:r>
     </w:p>
     <w:p>
@@ -7173,7 +7367,23 @@
           <w:rFonts w:asciiTheme="minorHAnsi" w:hAnsiTheme="minorHAnsi" w:cstheme="minorHAnsi"/>
           <w:bCs/>
         </w:rPr>
-        <w:t>Please give details.</w:t>
+        <w:t xml:space="preserve">Please </w:t>
+      </w:r>
+      <w:proofErr w:type="gramStart"/>
+      <w:r>
+        <w:rPr>
+          <w:rFonts w:asciiTheme="minorHAnsi" w:hAnsiTheme="minorHAnsi" w:cstheme="minorHAnsi"/>
+          <w:bCs/>
+        </w:rPr>
+        <w:t>give</w:t>
+      </w:r>
+      <w:proofErr w:type="gramEnd"/>
+      <w:r>
+        <w:rPr>
+          <w:rFonts w:asciiTheme="minorHAnsi" w:hAnsiTheme="minorHAnsi" w:cstheme="minorHAnsi"/>
+          <w:bCs/>
+        </w:rPr>
+        <w:t xml:space="preserve"> details.</w:t>
       </w:r>
     </w:p>
     <w:p>
@@ -7316,13 +7526,26 @@
         <w:rPr>
           <w:rFonts w:asciiTheme="minorHAnsi" w:hAnsiTheme="minorHAnsi" w:cstheme="minorHAnsi"/>
         </w:rPr>
-        <w:t>If yes, give date:</w:t>
+        <w:t>If yes, give date</w:t>
+      </w:r>
+      <w:proofErr w:type="gramStart"/>
+      <w:r>
+        <w:rPr>
+          <w:rFonts w:asciiTheme="minorHAnsi" w:hAnsiTheme="minorHAnsi" w:cstheme="minorHAnsi"/>
+        </w:rPr>
+        <w:t>:</w:t>
       </w:r>
       <w:r>
         <w:rPr>
           <w:rFonts w:asciiTheme="minorHAnsi" w:hAnsiTheme="minorHAnsi" w:cstheme="minorHAnsi"/>
         </w:rPr>
         <w:tab/>
+      </w:r>
+      <w:proofErr w:type="gramEnd"/>
+      <w:r>
+        <w:rPr>
+          <w:rFonts w:asciiTheme="minorHAnsi" w:hAnsiTheme="minorHAnsi" w:cstheme="minorHAnsi"/>
+        </w:rPr>
         <w:t>_______________</w:t>
       </w:r>
       <w:r>
@@ -7616,6 +7839,7 @@
         </w:rPr>
         <w:t>Inventor:</w:t>
       </w:r>
+      <w:proofErr w:type="gramStart"/>
       <w:r>
         <w:rPr>
           <w:rFonts w:asciiTheme="minorHAnsi" w:hAnsiTheme="minorHAnsi" w:cstheme="minorHAnsi"/>
@@ -7628,6 +7852,12 @@
           <w:rFonts w:asciiTheme="minorHAnsi" w:hAnsiTheme="minorHAnsi" w:cstheme="minorHAnsi"/>
         </w:rPr>
         <w:tab/>
+      </w:r>
+      <w:proofErr w:type="gramEnd"/>
+      <w:r>
+        <w:rPr>
+          <w:rFonts w:asciiTheme="minorHAnsi" w:hAnsiTheme="minorHAnsi" w:cstheme="minorHAnsi"/>
+        </w:rPr>
         <w:t>_______________________</w:t>
       </w:r>
     </w:p>
@@ -9362,19 +9592,58 @@
 </file>
 
 <file path=customXml/item1.xml><?xml version="1.0" encoding="utf-8"?>
-<b:Sources xmlns:b="http://schemas.openxmlformats.org/officeDocument/2006/bibliography" xmlns="http://schemas.openxmlformats.org/officeDocument/2006/bibliography" SelectedStyle="\HarvardAnglia2008OfficeOnline.xsl" StyleName="Harvard - Anglia" Version="2008"/>
+<p:properties xmlns:p="http://schemas.microsoft.com/office/2006/metadata/properties" xmlns:xsi="http://www.w3.org/2001/XMLSchema-instance" xmlns:pc="http://schemas.microsoft.com/office/infopath/2007/PartnerControls">
+  <documentManagement>
+    <Teams_Channel_Section_Location xmlns="ac56161a-35a2-4bac-99b6-8739237dc4f6" xsi:nil="true"/>
+    <Invited_Students xmlns="ac56161a-35a2-4bac-99b6-8739237dc4f6" xsi:nil="true"/>
+    <Distribution_Groups xmlns="ac56161a-35a2-4bac-99b6-8739237dc4f6" xsi:nil="true"/>
+    <Math_Settings xmlns="ac56161a-35a2-4bac-99b6-8739237dc4f6" xsi:nil="true"/>
+    <FolderType xmlns="ac56161a-35a2-4bac-99b6-8739237dc4f6" xsi:nil="true"/>
+    <Teachers xmlns="ac56161a-35a2-4bac-99b6-8739237dc4f6">
+      <UserInfo>
+        <DisplayName/>
+        <AccountId xsi:nil="true"/>
+        <AccountType/>
+      </UserInfo>
+    </Teachers>
+    <Student_Groups xmlns="ac56161a-35a2-4bac-99b6-8739237dc4f6">
+      <UserInfo>
+        <DisplayName/>
+        <AccountId xsi:nil="true"/>
+        <AccountType/>
+      </UserInfo>
+    </Student_Groups>
+    <Self_Registration_Enabled xmlns="ac56161a-35a2-4bac-99b6-8739237dc4f6" xsi:nil="true"/>
+    <CultureName xmlns="ac56161a-35a2-4bac-99b6-8739237dc4f6" xsi:nil="true"/>
+    <Students xmlns="ac56161a-35a2-4bac-99b6-8739237dc4f6">
+      <UserInfo>
+        <DisplayName/>
+        <AccountId xsi:nil="true"/>
+        <AccountType/>
+      </UserInfo>
+    </Students>
+    <Is_Collaboration_Space_Locked xmlns="ac56161a-35a2-4bac-99b6-8739237dc4f6" xsi:nil="true"/>
+    <LMS_Mappings xmlns="ac56161a-35a2-4bac-99b6-8739237dc4f6" xsi:nil="true"/>
+    <IsNotebookLocked xmlns="ac56161a-35a2-4bac-99b6-8739237dc4f6" xsi:nil="true"/>
+    <Owner xmlns="ac56161a-35a2-4bac-99b6-8739237dc4f6">
+      <UserInfo>
+        <DisplayName/>
+        <AccountId xsi:nil="true"/>
+        <AccountType/>
+      </UserInfo>
+    </Owner>
+    <Has_Teacher_Only_SectionGroup xmlns="ac56161a-35a2-4bac-99b6-8739237dc4f6" xsi:nil="true"/>
+    <DefaultSectionNames xmlns="ac56161a-35a2-4bac-99b6-8739237dc4f6" xsi:nil="true"/>
+    <AppVersion xmlns="ac56161a-35a2-4bac-99b6-8739237dc4f6" xsi:nil="true"/>
+    <TeamsChannelId xmlns="ac56161a-35a2-4bac-99b6-8739237dc4f6" xsi:nil="true"/>
+    <Invited_Teachers xmlns="ac56161a-35a2-4bac-99b6-8739237dc4f6" xsi:nil="true"/>
+    <NotebookType xmlns="ac56161a-35a2-4bac-99b6-8739237dc4f6" xsi:nil="true"/>
+    <Templates xmlns="ac56161a-35a2-4bac-99b6-8739237dc4f6" xsi:nil="true"/>
+  </documentManagement>
+</p:properties>
 </file>
 
 <file path=customXml/item2.xml><?xml version="1.0" encoding="utf-8"?>
-<?mso-contentType ?>
-<FormTemplates xmlns="http://schemas.microsoft.com/sharepoint/v3/contenttype/forms">
-  <Display>DocumentLibraryForm</Display>
-  <Edit>DocumentLibraryForm</Edit>
-  <New>DocumentLibraryForm</New>
-</FormTemplates>
-</file>
-
-<file path=customXml/item3.xml><?xml version="1.0" encoding="utf-8"?>
 <ct:contentTypeSchema xmlns:ct="http://schemas.microsoft.com/office/2006/metadata/contentType" xmlns:ma="http://schemas.microsoft.com/office/2006/metadata/properties/metaAttributes" ct:_="" ma:_="" ma:contentTypeName="Document" ma:contentTypeID="0x0101003EE04D916D7611488AA759BAA9A37716" ma:contentTypeVersion="34" ma:contentTypeDescription="Create a new document." ma:contentTypeScope="" ma:versionID="da43fd5ae1f7ae53ffd28d894363bfb4">
   <xsd:schema xmlns:xsd="http://www.w3.org/2001/XMLSchema" xmlns:xs="http://www.w3.org/2001/XMLSchema" xmlns:p="http://schemas.microsoft.com/office/2006/metadata/properties" xmlns:ns3="05ee331b-510f-4173-a5cc-a06d55a316fd" xmlns:ns4="ac56161a-35a2-4bac-99b6-8739237dc4f6" targetNamespace="http://schemas.microsoft.com/office/2006/metadata/properties" ma:root="true" ma:fieldsID="0e753ad016b352eaafbd0268c41c2a23" ns3:_="" ns4:_="">
     <xsd:import namespace="05ee331b-510f-4173-a5cc-a06d55a316fd"/>
@@ -9791,75 +10060,30 @@
 </ct:contentTypeSchema>
 </file>
 
+<file path=customXml/item3.xml><?xml version="1.0" encoding="utf-8"?>
+<?mso-contentType ?>
+<FormTemplates xmlns="http://schemas.microsoft.com/sharepoint/v3/contenttype/forms">
+  <Display>DocumentLibraryForm</Display>
+  <Edit>DocumentLibraryForm</Edit>
+  <New>DocumentLibraryForm</New>
+</FormTemplates>
+</file>
+
 <file path=customXml/item4.xml><?xml version="1.0" encoding="utf-8"?>
-<p:properties xmlns:p="http://schemas.microsoft.com/office/2006/metadata/properties" xmlns:xsi="http://www.w3.org/2001/XMLSchema-instance" xmlns:pc="http://schemas.microsoft.com/office/infopath/2007/PartnerControls">
-  <documentManagement>
-    <Teams_Channel_Section_Location xmlns="ac56161a-35a2-4bac-99b6-8739237dc4f6" xsi:nil="true"/>
-    <Invited_Students xmlns="ac56161a-35a2-4bac-99b6-8739237dc4f6" xsi:nil="true"/>
-    <Distribution_Groups xmlns="ac56161a-35a2-4bac-99b6-8739237dc4f6" xsi:nil="true"/>
-    <Math_Settings xmlns="ac56161a-35a2-4bac-99b6-8739237dc4f6" xsi:nil="true"/>
-    <FolderType xmlns="ac56161a-35a2-4bac-99b6-8739237dc4f6" xsi:nil="true"/>
-    <Teachers xmlns="ac56161a-35a2-4bac-99b6-8739237dc4f6">
-      <UserInfo>
-        <DisplayName/>
-        <AccountId xsi:nil="true"/>
-        <AccountType/>
-      </UserInfo>
-    </Teachers>
-    <Student_Groups xmlns="ac56161a-35a2-4bac-99b6-8739237dc4f6">
-      <UserInfo>
-        <DisplayName/>
-        <AccountId xsi:nil="true"/>
-        <AccountType/>
-      </UserInfo>
-    </Student_Groups>
-    <Self_Registration_Enabled xmlns="ac56161a-35a2-4bac-99b6-8739237dc4f6" xsi:nil="true"/>
-    <CultureName xmlns="ac56161a-35a2-4bac-99b6-8739237dc4f6" xsi:nil="true"/>
-    <Students xmlns="ac56161a-35a2-4bac-99b6-8739237dc4f6">
-      <UserInfo>
-        <DisplayName/>
-        <AccountId xsi:nil="true"/>
-        <AccountType/>
-      </UserInfo>
-    </Students>
-    <Is_Collaboration_Space_Locked xmlns="ac56161a-35a2-4bac-99b6-8739237dc4f6" xsi:nil="true"/>
-    <LMS_Mappings xmlns="ac56161a-35a2-4bac-99b6-8739237dc4f6" xsi:nil="true"/>
-    <IsNotebookLocked xmlns="ac56161a-35a2-4bac-99b6-8739237dc4f6" xsi:nil="true"/>
-    <Owner xmlns="ac56161a-35a2-4bac-99b6-8739237dc4f6">
-      <UserInfo>
-        <DisplayName/>
-        <AccountId xsi:nil="true"/>
-        <AccountType/>
-      </UserInfo>
-    </Owner>
-    <Has_Teacher_Only_SectionGroup xmlns="ac56161a-35a2-4bac-99b6-8739237dc4f6" xsi:nil="true"/>
-    <DefaultSectionNames xmlns="ac56161a-35a2-4bac-99b6-8739237dc4f6" xsi:nil="true"/>
-    <AppVersion xmlns="ac56161a-35a2-4bac-99b6-8739237dc4f6" xsi:nil="true"/>
-    <TeamsChannelId xmlns="ac56161a-35a2-4bac-99b6-8739237dc4f6" xsi:nil="true"/>
-    <Invited_Teachers xmlns="ac56161a-35a2-4bac-99b6-8739237dc4f6" xsi:nil="true"/>
-    <NotebookType xmlns="ac56161a-35a2-4bac-99b6-8739237dc4f6" xsi:nil="true"/>
-    <Templates xmlns="ac56161a-35a2-4bac-99b6-8739237dc4f6" xsi:nil="true"/>
-  </documentManagement>
-</p:properties>
+<b:Sources xmlns:b="http://schemas.openxmlformats.org/officeDocument/2006/bibliography" xmlns="http://schemas.openxmlformats.org/officeDocument/2006/bibliography" SelectedStyle="\HarvardAnglia2008OfficeOnline.xsl" StyleName="Harvard - Anglia" Version="2008"/>
 </file>
 
 <file path=customXml/itemProps1.xml><?xml version="1.0" encoding="utf-8"?>
-<ds:datastoreItem xmlns:ds="http://schemas.openxmlformats.org/officeDocument/2006/customXml" ds:itemID="{6C95B990-55DE-4564-83E5-DFE2C07FF9DD}">
+<ds:datastoreItem xmlns:ds="http://schemas.openxmlformats.org/officeDocument/2006/customXml" ds:itemID="{5C51FF54-1CBD-43E8-9B2A-B56F20CDF09A}">
   <ds:schemaRefs>
-    <ds:schemaRef ds:uri="http://schemas.openxmlformats.org/officeDocument/2006/bibliography"/>
+    <ds:schemaRef ds:uri="http://schemas.microsoft.com/office/2006/metadata/properties"/>
+    <ds:schemaRef ds:uri="http://schemas.microsoft.com/office/infopath/2007/PartnerControls"/>
+    <ds:schemaRef ds:uri="ac56161a-35a2-4bac-99b6-8739237dc4f6"/>
   </ds:schemaRefs>
 </ds:datastoreItem>
 </file>
 
 <file path=customXml/itemProps2.xml><?xml version="1.0" encoding="utf-8"?>
-<ds:datastoreItem xmlns:ds="http://schemas.openxmlformats.org/officeDocument/2006/customXml" ds:itemID="{9B975280-634C-49AE-9293-B75FDC4277EB}">
-  <ds:schemaRefs>
-    <ds:schemaRef ds:uri="http://schemas.microsoft.com/sharepoint/v3/contenttype/forms"/>
-  </ds:schemaRefs>
-</ds:datastoreItem>
-</file>
-
-<file path=customXml/itemProps3.xml><?xml version="1.0" encoding="utf-8"?>
 <ds:datastoreItem xmlns:ds="http://schemas.openxmlformats.org/officeDocument/2006/customXml" ds:itemID="{3B693098-FF00-4095-9757-18FD92BDA8E2}">
   <ds:schemaRefs>
     <ds:schemaRef ds:uri="http://schemas.microsoft.com/office/2006/metadata/contentType"/>
@@ -9878,12 +10102,18 @@
 </ds:datastoreItem>
 </file>
 
+<file path=customXml/itemProps3.xml><?xml version="1.0" encoding="utf-8"?>
+<ds:datastoreItem xmlns:ds="http://schemas.openxmlformats.org/officeDocument/2006/customXml" ds:itemID="{9B975280-634C-49AE-9293-B75FDC4277EB}">
+  <ds:schemaRefs>
+    <ds:schemaRef ds:uri="http://schemas.microsoft.com/sharepoint/v3/contenttype/forms"/>
+  </ds:schemaRefs>
+</ds:datastoreItem>
+</file>
+
 <file path=customXml/itemProps4.xml><?xml version="1.0" encoding="utf-8"?>
-<ds:datastoreItem xmlns:ds="http://schemas.openxmlformats.org/officeDocument/2006/customXml" ds:itemID="{5C51FF54-1CBD-43E8-9B2A-B56F20CDF09A}">
+<ds:datastoreItem xmlns:ds="http://schemas.openxmlformats.org/officeDocument/2006/customXml" ds:itemID="{6C95B990-55DE-4564-83E5-DFE2C07FF9DD}">
   <ds:schemaRefs>
-    <ds:schemaRef ds:uri="http://schemas.microsoft.com/office/2006/metadata/properties"/>
-    <ds:schemaRef ds:uri="http://schemas.microsoft.com/office/infopath/2007/PartnerControls"/>
-    <ds:schemaRef ds:uri="ac56161a-35a2-4bac-99b6-8739237dc4f6"/>
+    <ds:schemaRef ds:uri="http://schemas.openxmlformats.org/officeDocument/2006/bibliography"/>
   </ds:schemaRefs>
 </ds:datastoreItem>
 </file>
</xml_diff>